<commit_message>
Fronted with apis, solution errors backend and review backend cors
</commit_message>
<xml_diff>
--- a/Documentos/2025-20 PATIC 1 -  Formulación de Propuesta.docx
+++ b/Documentos/2025-20 PATIC 1 -  Formulación de Propuesta.docx
@@ -24422,6 +24422,12 @@
 </file>
 
 <file path=customXml/item1.xml><?xml version="1.0" encoding="utf-8"?>
+<p:properties xmlns:p="http://schemas.microsoft.com/office/2006/metadata/properties" xmlns:xsi="http://www.w3.org/2001/XMLSchema-instance" xmlns:pc="http://schemas.microsoft.com/office/infopath/2007/PartnerControls">
+  <documentManagement/>
+</p:properties>
+</file>
+
+<file path=customXml/item2.xml><?xml version="1.0" encoding="utf-8"?>
 <b:Sources xmlns:b="http://schemas.openxmlformats.org/officeDocument/2006/bibliography" xmlns="http://schemas.openxmlformats.org/officeDocument/2006/bibliography" SelectedStyle="\APASixthEditionOfficeOnline.xsl" StyleName="APA" Version="6">
   <b:Source>
     <b:Tag>Dav24</b:Tag>
@@ -24555,13 +24561,16 @@
 </b:Sources>
 </file>
 
-<file path=customXml/item2.xml><?xml version="1.0" encoding="utf-8"?>
-<p:properties xmlns:p="http://schemas.microsoft.com/office/2006/metadata/properties" xmlns:xsi="http://www.w3.org/2001/XMLSchema-instance" xmlns:pc="http://schemas.microsoft.com/office/infopath/2007/PartnerControls">
-  <documentManagement/>
-</p:properties>
+<file path=customXml/item3.xml><?xml version="1.0" encoding="utf-8"?>
+<?mso-contentType ?>
+<FormTemplates xmlns="http://schemas.microsoft.com/sharepoint/v3/contenttype/forms">
+  <Display>DocumentLibraryForm</Display>
+  <Edit>DocumentLibraryForm</Edit>
+  <New>DocumentLibraryForm</New>
+</FormTemplates>
 </file>
 
-<file path=customXml/item3.xml><?xml version="1.0" encoding="utf-8"?>
+<file path=customXml/item4.xml><?xml version="1.0" encoding="utf-8"?>
 <ct:contentTypeSchema xmlns:ct="http://schemas.microsoft.com/office/2006/metadata/contentType" xmlns:ma="http://schemas.microsoft.com/office/2006/metadata/properties/metaAttributes" ct:_="" ma:_="" ma:contentTypeName="Document" ma:contentTypeID="0x010100C1A4DD92108DD94C9F753688388D372D" ma:contentTypeVersion="3" ma:contentTypeDescription="Create a new document." ma:contentTypeScope="" ma:versionID="4c9fe605287612181c6848d8df7cb982">
   <xsd:schema xmlns:xsd="http://www.w3.org/2001/XMLSchema" xmlns:xs="http://www.w3.org/2001/XMLSchema" xmlns:p="http://schemas.microsoft.com/office/2006/metadata/properties" xmlns:ns2="f5bb5be3-fea3-406a-9674-8c516d1682a9" targetNamespace="http://schemas.microsoft.com/office/2006/metadata/properties" ma:root="true" ma:fieldsID="64277071cda8564c54cb2106b45b6eba" ns2:_="">
     <xsd:import namespace="f5bb5be3-fea3-406a-9674-8c516d1682a9"/>
@@ -24699,24 +24708,7 @@
 </ct:contentTypeSchema>
 </file>
 
-<file path=customXml/item4.xml><?xml version="1.0" encoding="utf-8"?>
-<?mso-contentType ?>
-<FormTemplates xmlns="http://schemas.microsoft.com/sharepoint/v3/contenttype/forms">
-  <Display>DocumentLibraryForm</Display>
-  <Edit>DocumentLibraryForm</Edit>
-  <New>DocumentLibraryForm</New>
-</FormTemplates>
-</file>
-
 <file path=customXml/itemProps1.xml><?xml version="1.0" encoding="utf-8"?>
-<ds:datastoreItem xmlns:ds="http://schemas.openxmlformats.org/officeDocument/2006/customXml" ds:itemID="{E390CBC9-08EB-4A1A-96F2-E0A8F5710F0F}">
-  <ds:schemaRefs>
-    <ds:schemaRef ds:uri="http://schemas.openxmlformats.org/officeDocument/2006/bibliography"/>
-  </ds:schemaRefs>
-</ds:datastoreItem>
-</file>
-
-<file path=customXml/itemProps2.xml><?xml version="1.0" encoding="utf-8"?>
 <ds:datastoreItem xmlns:ds="http://schemas.openxmlformats.org/officeDocument/2006/customXml" ds:itemID="{45C8693C-5C48-43E9-A94F-CE03FAB861DF}">
   <ds:schemaRefs>
     <ds:schemaRef ds:uri="http://schemas.microsoft.com/office/2006/metadata/properties"/>
@@ -24725,7 +24717,23 @@
 </ds:datastoreItem>
 </file>
 
+<file path=customXml/itemProps2.xml><?xml version="1.0" encoding="utf-8"?>
+<ds:datastoreItem xmlns:ds="http://schemas.openxmlformats.org/officeDocument/2006/customXml" ds:itemID="{E390CBC9-08EB-4A1A-96F2-E0A8F5710F0F}">
+  <ds:schemaRefs>
+    <ds:schemaRef ds:uri="http://schemas.openxmlformats.org/officeDocument/2006/bibliography"/>
+  </ds:schemaRefs>
+</ds:datastoreItem>
+</file>
+
 <file path=customXml/itemProps3.xml><?xml version="1.0" encoding="utf-8"?>
+<ds:datastoreItem xmlns:ds="http://schemas.openxmlformats.org/officeDocument/2006/customXml" ds:itemID="{1A000BD8-9404-498E-B6EB-D94F5E220F24}">
+  <ds:schemaRefs>
+    <ds:schemaRef ds:uri="http://schemas.microsoft.com/sharepoint/v3/contenttype/forms"/>
+  </ds:schemaRefs>
+</ds:datastoreItem>
+</file>
+
+<file path=customXml/itemProps4.xml><?xml version="1.0" encoding="utf-8"?>
 <ds:datastoreItem xmlns:ds="http://schemas.openxmlformats.org/officeDocument/2006/customXml" ds:itemID="{0C5CF52B-2F17-454D-BCFE-BF523646DEE6}">
   <ds:schemaRefs>
     <ds:schemaRef ds:uri="http://schemas.microsoft.com/office/2006/metadata/contentType"/>
@@ -24743,14 +24751,6 @@
 </ds:datastoreItem>
 </file>
 
-<file path=customXml/itemProps4.xml><?xml version="1.0" encoding="utf-8"?>
-<ds:datastoreItem xmlns:ds="http://schemas.openxmlformats.org/officeDocument/2006/customXml" ds:itemID="{1A000BD8-9404-498E-B6EB-D94F5E220F24}">
-  <ds:schemaRefs>
-    <ds:schemaRef ds:uri="http://schemas.microsoft.com/sharepoint/v3/contenttype/forms"/>
-  </ds:schemaRefs>
-</ds:datastoreItem>
-</file>
-
 <file path=docMetadata/LabelInfo.xml><?xml version="1.0" encoding="utf-8"?>
 <clbl:labelList xmlns:clbl="http://schemas.microsoft.com/office/2020/mipLabelMetadata">
   <clbl:label id="{618bab0f-20a4-4de3-a10c-e20cee96bb35}" enabled="0" method="" siteId="{618bab0f-20a4-4de3-a10c-e20cee96bb35}" removed="1"/>

</xml_diff>